<commit_message>
fix UI mobile Dashboard
</commit_message>
<xml_diff>
--- a/public/template_BC.docx
+++ b/public/template_BC.docx
@@ -13,6 +13,8 @@
           <w:lang w:val="en-US"/>
         </w:rPr>
       </w:pPr>
+      <w:bookmarkStart w:id="0" w:name="_GoBack"/>
+      <w:bookmarkEnd w:id="0"/>
       <w:r>
         <w:rPr>
           <w:b/>
@@ -208,16 +210,16 @@
         <w:tblLook w:val="0400" w:firstRow="0" w:lastRow="0" w:firstColumn="0" w:lastColumn="0" w:noHBand="0" w:noVBand="1"/>
       </w:tblPr>
       <w:tblGrid>
-        <w:gridCol w:w="1327"/>
-        <w:gridCol w:w="2903"/>
-        <w:gridCol w:w="990"/>
-        <w:gridCol w:w="1530"/>
-        <w:gridCol w:w="4230"/>
+        <w:gridCol w:w="1260"/>
+        <w:gridCol w:w="2250"/>
+        <w:gridCol w:w="1170"/>
+        <w:gridCol w:w="3420"/>
+        <w:gridCol w:w="2880"/>
       </w:tblGrid>
       <w:tr>
         <w:tc>
           <w:tcPr>
-            <w:tcW w:w="1327" w:type="dxa"/>
+            <w:tcW w:w="1260" w:type="dxa"/>
             <w:vAlign w:val="center"/>
           </w:tcPr>
           <w:p>
@@ -244,7 +246,7 @@
         </w:tc>
         <w:tc>
           <w:tcPr>
-            <w:tcW w:w="2903" w:type="dxa"/>
+            <w:tcW w:w="2250" w:type="dxa"/>
             <w:vAlign w:val="center"/>
           </w:tcPr>
           <w:p>
@@ -265,7 +267,7 @@
         </w:tc>
         <w:tc>
           <w:tcPr>
-            <w:tcW w:w="990" w:type="dxa"/>
+            <w:tcW w:w="1170" w:type="dxa"/>
             <w:vAlign w:val="center"/>
           </w:tcPr>
           <w:p>
@@ -292,7 +294,7 @@
         </w:tc>
         <w:tc>
           <w:tcPr>
-            <w:tcW w:w="1530" w:type="dxa"/>
+            <w:tcW w:w="3420" w:type="dxa"/>
             <w:vAlign w:val="center"/>
           </w:tcPr>
           <w:p>
@@ -317,7 +319,7 @@
         </w:tc>
         <w:tc>
           <w:tcPr>
-            <w:tcW w:w="4230" w:type="dxa"/>
+            <w:tcW w:w="2880" w:type="dxa"/>
             <w:vAlign w:val="center"/>
           </w:tcPr>
           <w:p>
@@ -349,7 +351,7 @@
         </w:trPr>
         <w:tc>
           <w:tcPr>
-            <w:tcW w:w="1327" w:type="dxa"/>
+            <w:tcW w:w="1260" w:type="dxa"/>
           </w:tcPr>
           <w:p>
             <w:pPr>
@@ -377,7 +379,7 @@
         </w:tc>
         <w:tc>
           <w:tcPr>
-            <w:tcW w:w="2903" w:type="dxa"/>
+            <w:tcW w:w="2250" w:type="dxa"/>
           </w:tcPr>
           <w:p>
             <w:pPr>
@@ -399,7 +401,7 @@
         </w:tc>
         <w:tc>
           <w:tcPr>
-            <w:tcW w:w="990" w:type="dxa"/>
+            <w:tcW w:w="1170" w:type="dxa"/>
           </w:tcPr>
           <w:p>
             <w:pPr>
@@ -433,7 +435,7 @@
         </w:tc>
         <w:tc>
           <w:tcPr>
-            <w:tcW w:w="1530" w:type="dxa"/>
+            <w:tcW w:w="3420" w:type="dxa"/>
           </w:tcPr>
           <w:p>
             <w:pPr>
@@ -466,7 +468,7 @@
         </w:tc>
         <w:tc>
           <w:tcPr>
-            <w:tcW w:w="4230" w:type="dxa"/>
+            <w:tcW w:w="2880" w:type="dxa"/>
           </w:tcPr>
           <w:p>
             <w:pPr>
@@ -568,8 +570,6 @@
         </w:rPr>
         <w:t xml:space="preserve">   </w:t>
       </w:r>
-      <w:bookmarkStart w:id="0" w:name="_GoBack"/>
-      <w:bookmarkEnd w:id="0"/>
       <w:r>
         <w:t xml:space="preserve"> </w:t>
       </w:r>

</xml_diff>

<commit_message>
add data and completed
</commit_message>
<xml_diff>
--- a/public/template_BC.docx
+++ b/public/template_BC.docx
@@ -13,8 +13,6 @@
           <w:lang w:val="en-US"/>
         </w:rPr>
       </w:pPr>
-      <w:bookmarkStart w:id="0" w:name="_GoBack"/>
-      <w:bookmarkEnd w:id="0"/>
       <w:r>
         <w:rPr>
           <w:b/>
@@ -550,7 +548,13 @@
         <w:rPr>
           <w:lang w:val="en-US"/>
         </w:rPr>
-        <w:t xml:space="preserve">       Thanh Vân</w:t>
+        <w:t xml:space="preserve"> Bùi Thị</w:t>
+      </w:r>
+      <w:r>
+        <w:rPr>
+          <w:lang w:val="en-US"/>
+        </w:rPr>
+        <w:t xml:space="preserve"> Thanh Vân</w:t>
       </w:r>
       <w:r>
         <w:t xml:space="preserve">                                       </w:t>
@@ -562,17 +566,10 @@
         <w:t xml:space="preserve">      </w:t>
       </w:r>
       <w:r>
-        <w:t xml:space="preserve">       </w:t>
+        <w:t xml:space="preserve">    </w:t>
       </w:r>
-      <w:r>
-        <w:rPr>
-          <w:lang w:val="en-US"/>
-        </w:rPr>
-        <w:t xml:space="preserve">   </w:t>
-      </w:r>
-      <w:r>
-        <w:t xml:space="preserve"> </w:t>
-      </w:r>
+      <w:bookmarkStart w:id="0" w:name="_GoBack"/>
+      <w:bookmarkEnd w:id="0"/>
       <w:r>
         <w:rPr>
           <w:lang w:val="en-US"/>

</xml_diff>